<commit_message>
Update docs with full 20260228 data analysis
- Fix Total DMG Bonus/RES scope in DOCX: confirmed universal via
  healthTarget(), not limited to life steal/spirit as previously stated
- Add 4 new DOCX sections: recordDamage/counterDamage mechanics, PvP
  injury reduce table (L1-L220), attribute caps, extended attribute
  system (192 total across 7 ID ranges)
- Document 34 undocumented buff groups in encyclopedia (76 total vs 46
  named), including tiered freeze escalation (groups 271-279), unit
  summoning system (group 5, 53 buffs), and conditional buff logic
  (group 504)
- Resolve unknowns 1-4 (PvP table, attribute caps, skill config, unit
  types) and fully document U6-U8 (seasonPveDamAdd, recordDamage,
  counterDamage) with complete formulas
- Regenerate plain English DOCX guide
</commit_message>
<xml_diff>
--- a/reverse-engineered/LOM_Combat_Reference_Plain_English.docx
+++ b/reverse-engineered/LOM_Combat_Reference_Plain_English.docx
@@ -35,7 +35,7 @@
           <w:color w:val="666666"/>
           <w:sz w:val="24"/>
         </w:rPr>
-        <w:t>Plain English Edition — February 2026</w:t>
+        <w:t>Plain English Edition — March 2026</w:t>
       </w:r>
     </w:p>
     <w:p/>
@@ -2235,7 +2235,7 @@
           <w:b/>
           <w:color w:val="CC4400"/>
         </w:rPr>
-        <w:t>HP-based damage is NOT affected by DMG Resistance (resist) or Total DMG Bonus/RES. It completely skips those calculations. It only goes through PvP reduction and shield absorption.</w:t>
+        <w:t>HP-based damage skips DMG Resistance (resist, ID 1021) — it bypasses calHurt(). However, Total DMG Bonus/RES DOES apply because HP-based damage passes through healthTarget() with HealthType.Hurt, which is in NeedAddDamHurtList. After Total DMG, it goes through PvP reduction and shield absorption.</w:t>
       </w:r>
     </w:p>
     <w:p>
@@ -3392,7 +3392,7 @@
     </w:p>
     <w:p>
       <w:r>
-        <w:t>This system works differently from what community docs suggest:</w:t>
+        <w:t>This is a universal final damage multiplier applied through SkillRunner.healthTarget() to ALL 13 offensive damage types (normal, crit, combo, counter, bleed, real damage, spirit-to-player, shared damage, and return/reflect damage). It is subtractive:</w:t>
       </w:r>
     </w:p>
     <w:p>
@@ -3411,7 +3411,12 @@
     </w:p>
     <w:p>
       <w:r>
-        <w:t>It's subtractive: your Total DMG Bonus minus the enemy's Total DMG Resistance, added to 1. The result has a floor of 0.20 (20%) — damage can never be reduced below 20% by this system.</w:t>
+        <w:t>Your Total DMG Bonus minus the enemy's Total DMG Resistance, added to 1. The result has a floor of 0.20 (20%) — damage can never be reduced below 20% by this system.</w:t>
+      </w:r>
+    </w:p>
+    <w:p>
+      <w:r>
+        <w:t>This is applied AFTER all buff modifiers (Fragile, Extra Damage, Giant Slayer, boss damage) and BEFORE damage is queued for application. It is the last multiplicative layer before PvP reduction.</w:t>
       </w:r>
     </w:p>
     <w:p>
@@ -3420,7 +3425,7 @@
           <w:b/>
           <w:color w:val="CC4400"/>
         </w:rPr>
-        <w:t>IMPORTANT: Total DMG Bonus/RES does NOT apply to all damage as a "final layer." Based on code analysis, it primarily applies through the life steal (BuffVampire) system and Spirit damage. Normal attacks, combos, counters, and skill damage do NOT have Total DMG Bonus/RES applied. They use the separate "resist" stat (DMG Resistance, ID 1021) instead.</w:t>
+        <w:t>Total DMG Bonus/RES is SEPARATE from DMG Resistance (resist, ID 1021). Both apply, but at different pipeline stages: DMG Resistance is applied early during calHurt(), while Total DMG is applied late in healthTarget(). They stack multiplicatively. Additionally, BuffVampire (life steal) uses the same formula independently for heal calculations.</w:t>
       </w:r>
     </w:p>
     <w:p>
@@ -3495,66 +3500,89 @@
       </w:r>
     </w:p>
     <w:p>
+      <w:r>
+        <w:t>10. Apply recordDamage bonus: damage * (1 + recordDamage[skillId] / 10000) — cumulative per-skill bonus from USE_SKILL_ADD buffs</w:t>
+      </w:r>
+    </w:p>
+    <w:p>
+      <w:r>
+        <w:t>11. Apply counterDamage multiplier: damage * skill.counterDamage — per-skill config multiplier (default 1.0)</w:t>
+      </w:r>
+    </w:p>
+    <w:p>
       <w:pPr>
         <w:pStyle w:val="Heading2"/>
       </w:pPr>
       <w:r>
+        <w:t>Delivery Phase (healthTarget)</w:t>
+      </w:r>
+    </w:p>
+    <w:p>
+      <w:r>
+        <w:t>12. Total DMG Bonus/RES: damage * max(1 + total_dam_add - total_dam_def, 0.20) — applied to all 13 damage types when attacker != target</w:t>
+      </w:r>
+    </w:p>
+    <w:p>
+      <w:pPr>
+        <w:pStyle w:val="Heading2"/>
+      </w:pPr>
+      <w:r>
         <w:t>Application Phase (applying the number)</w:t>
       </w:r>
     </w:p>
     <w:p>
       <w:r>
-        <w:t>10. Skip if battle is transitioning between phases</w:t>
-      </w:r>
-    </w:p>
-    <w:p>
-      <w:r>
-        <w:t>11. PvP reduction: divide by injuryReduce (minimum 1 damage)</w:t>
-      </w:r>
-    </w:p>
-    <w:p>
-      <w:r>
-        <w:t>12. Season PvE bonus (if applicable)</w:t>
-      </w:r>
-    </w:p>
-    <w:p>
-      <w:r>
-        <w:t>13. Shield absorption: shields absorb as much as they can, remainder passes through</w:t>
-      </w:r>
-    </w:p>
-    <w:p>
-      <w:r>
-        <w:t>14. Block absorption: block buffs absorb remaining damage</w:t>
-      </w:r>
-    </w:p>
-    <w:p>
-      <w:r>
-        <w:t>15. Subtract remaining damage from HP</w:t>
-      </w:r>
-    </w:p>
-    <w:p>
-      <w:r>
-        <w:t>16. Death prevention checks: Time Reversal &gt; Remake HP &gt; Immune Death</w:t>
-      </w:r>
-    </w:p>
-    <w:p>
-      <w:r>
-        <w:t>17. If prevented from dying: HP stays at 1</w:t>
-      </w:r>
-    </w:p>
-    <w:p>
-      <w:r>
-        <w:t>18. Accumulate total damage dealt</w:t>
-      </w:r>
-    </w:p>
-    <w:p>
-      <w:r>
-        <w:t>19. Check HP change triggers</w:t>
-      </w:r>
-    </w:p>
-    <w:p>
-      <w:r>
-        <w:t>20. If HP &lt;= 0: unit dies</w:t>
+        <w:t>13. Skip if battle is transitioning between phases</w:t>
+      </w:r>
+    </w:p>
+    <w:p>
+      <w:r>
+        <w:t>14. PvP reduction: divide by injuryReduce (minimum 1 damage)</w:t>
+      </w:r>
+    </w:p>
+    <w:p>
+      <w:r>
+        <w:t>15. Season PvE bonus (if applicable): damage * (1 + seasonPveDamAdd), team 1 only, season PvE chapters</w:t>
+      </w:r>
+    </w:p>
+    <w:p>
+      <w:r>
+        <w:t>16. Shield absorption: shields absorb as much as they can, remainder passes through</w:t>
+      </w:r>
+    </w:p>
+    <w:p>
+      <w:r>
+        <w:t>17. Block absorption: block buffs absorb remaining damage</w:t>
+      </w:r>
+    </w:p>
+    <w:p>
+      <w:r>
+        <w:t>18. Subtract remaining damage from HP</w:t>
+      </w:r>
+    </w:p>
+    <w:p>
+      <w:r>
+        <w:t>19. Death prevention checks: Time Reversal &gt; Remake HP &gt; Immune Death</w:t>
+      </w:r>
+    </w:p>
+    <w:p>
+      <w:r>
+        <w:t>20. If prevented from dying: HP stays at 1</w:t>
+      </w:r>
+    </w:p>
+    <w:p>
+      <w:r>
+        <w:t>21. Accumulate total damage dealt</w:t>
+      </w:r>
+    </w:p>
+    <w:p>
+      <w:r>
+        <w:t>22. Check HP change triggers</w:t>
+      </w:r>
+    </w:p>
+    <w:p>
+      <w:r>
+        <w:t>23. If HP &lt;= 0: unit dies</w:t>
       </w:r>
     </w:p>
     <w:p>
@@ -3996,7 +4024,7 @@
         <w:pStyle w:val="Heading2"/>
       </w:pPr>
       <w:r>
-        <w:t>3. Total DMG Bonus/RES is Not Universal</w:t>
+        <w:t>3. Total DMG Bonus/RES IS Universal (Confirmed)</w:t>
       </w:r>
     </w:p>
     <w:p>
@@ -4006,12 +4034,12 @@
     </w:p>
     <w:p>
       <w:r>
-        <w:t>Actual code: Applied primarily through life steal (BuffVampire) and Spirit damage</w:t>
-      </w:r>
-    </w:p>
-    <w:p>
-      <w:r>
-        <w:t>Normal attacks, combos, counters, and most skill damage do NOT pass through Total DMG Bonus/RES. They use the separate "resist" stat instead.</w:t>
+        <w:t>Actual code: CONFIRMED — applied universally via SkillRunner.healthTarget() to all 13 damage types in NeedAddDamHurtList (normal, crit, combo, counter, bleed, real damage, shared damage, spirit-to-player, return/reflect).</w:t>
+      </w:r>
+    </w:p>
+    <w:p>
+      <w:r>
+        <w:t>This is indeed a final multiplicative layer, applied after all buff modifiers and before PvP reduction. Community understanding was correct on this point.</w:t>
       </w:r>
     </w:p>
     <w:p>
@@ -4127,7 +4155,7 @@
         <w:pStyle w:val="Heading2"/>
       </w:pPr>
       <w:r>
-        <w:t>10. HP-Based Damage Skips Resistances</w:t>
+        <w:t>10. HP-Based Damage Skips DMG Resistance but NOT Total DMG</w:t>
       </w:r>
     </w:p>
     <w:p>
@@ -4137,7 +4165,1911 @@
     </w:p>
     <w:p>
       <w:r>
-        <w:t>Actual code: HP-based damage is NOT affected by DMG Resistance (resist) or Total DMG Bonus/RES. It only goes through PvP reduction, clamping, and shield absorption.</w:t>
+        <w:t>Actual code: HP-based damage is NOT affected by DMG Resistance (resist, ID 1021) — it bypasses calHurt(). However, Total DMG Bonus/RES DOES apply because HP-based damage calls healthTarget() with HealthType.Hurt, which IS in NeedAddDamHurtList. It also goes through PvP reduction, clamping, and shield absorption.</w:t>
+      </w:r>
+    </w:p>
+    <w:p>
+      <w:r>
+        <w:br w:type="page"/>
+      </w:r>
+    </w:p>
+    <w:p>
+      <w:pPr>
+        <w:pStyle w:val="Heading1"/>
+      </w:pPr>
+      <w:r>
+        <w:t>17. Recently Discovered Mechanics</w:t>
+      </w:r>
+    </w:p>
+    <w:p>
+      <w:pPr>
+        <w:pStyle w:val="Heading2"/>
+      </w:pPr>
+      <w:r>
+        <w:t>17.1 Record Damage (Per-Skill Cumulative Bonus)</w:t>
+      </w:r>
+    </w:p>
+    <w:p>
+      <w:r>
+        <w:t>The recordDamage system is a per-skill damage accumulator driven by USE_SKILL_ADD buffs (BuffGroupType 190). Each time a skill is used, the accumulator for that skill ID increases by the buff's value. The bonus is then applied multiplicatively to skill damage:</w:t>
+      </w:r>
+    </w:p>
+    <w:p>
+      <w:pPr>
+        <w:spacing w:before="80" w:after="80"/>
+        <w:ind w:left="432"/>
+      </w:pPr>
+      <w:r>
+        <w:rPr>
+          <w:rFonts w:ascii="Consolas" w:hAnsi="Consolas"/>
+          <w:color w:val="333333"/>
+          <w:sz w:val="18"/>
+        </w:rPr>
+        <w:t>damage = roundInt(damage * round(1 + round(recordDamage[skillId] / 10000)))</w:t>
+      </w:r>
+    </w:p>
+    <w:p>
+      <w:r>
+        <w:t>For example, if recordDamage = 5000 (50%), then damage is multiplied by (1 + 0.5) = 1.5x.</w:t>
+      </w:r>
+    </w:p>
+    <w:p>
+      <w:r>
+        <w:t>The accumulator persists for the entire battle and is never reset. This means skills used more frequently get progressively stronger over the course of a fight. Applied in BuffSkillValue after Extra Damage and before resistance.</w:t>
+      </w:r>
+    </w:p>
+    <w:p>
+      <w:pPr>
+        <w:pStyle w:val="Heading2"/>
+      </w:pPr>
+      <w:r>
+        <w:t>17.2 Counter Damage Multiplier (Skill-Level)</w:t>
+      </w:r>
+    </w:p>
+    <w:p>
+      <w:r>
+        <w:t>counterDamage is a per-skill multiplier that defaults to 1.0 (no effect). It comes from the skill configuration (param5[0]) and is applied to skill damage:</w:t>
+      </w:r>
+    </w:p>
+    <w:p>
+      <w:pPr>
+        <w:spacing w:before="80" w:after="80"/>
+        <w:ind w:left="432"/>
+      </w:pPr>
+      <w:r>
+        <w:rPr>
+          <w:rFonts w:ascii="Consolas" w:hAnsi="Consolas"/>
+          <w:color w:val="333333"/>
+          <w:sz w:val="18"/>
+        </w:rPr>
+        <w:t>damage = roundInt(damage * skill.counterDamage)</w:t>
+      </w:r>
+    </w:p>
+    <w:p>
+      <w:r>
+        <w:t>Despite the name, this is NOT related to counter-attacks — it is a general skill-level multiplier set during skill creation. Applied immediately after recordDamage in the BuffSkillValue pipeline.</w:t>
+      </w:r>
+    </w:p>
+    <w:p>
+      <w:pPr>
+        <w:pStyle w:val="Heading2"/>
+      </w:pPr>
+      <w:r>
+        <w:t>17.3 Season PvE Damage Bonus</w:t>
+      </w:r>
+    </w:p>
+    <w:p>
+      <w:r>
+        <w:t>seasonPveDamAdd is a server-controlled bonus that only applies to team 1 (defending team) during season PvE chapters:</w:t>
+      </w:r>
+    </w:p>
+    <w:p>
+      <w:pPr>
+        <w:spacing w:before="80" w:after="80"/>
+        <w:ind w:left="432"/>
+      </w:pPr>
+      <w:r>
+        <w:rPr>
+          <w:rFonts w:ascii="Consolas" w:hAnsi="Consolas"/>
+          <w:color w:val="333333"/>
+          <w:sz w:val="18"/>
+        </w:rPr>
+        <w:t>damage = roundInt(damage * (1 + seasonPveDamAdd))</w:t>
+      </w:r>
+    </w:p>
+    <w:p>
+      <w:r>
+        <w:t>Applied in Unit.addDamage after PvP reduction and before shield absorption. The value comes from the server at battle start and persists for the entire battle. In non-season modes, this value is 0.</w:t>
+      </w:r>
+    </w:p>
+    <w:p>
+      <w:r>
+        <w:br w:type="page"/>
+      </w:r>
+    </w:p>
+    <w:p>
+      <w:pPr>
+        <w:pStyle w:val="Heading1"/>
+      </w:pPr>
+      <w:r>
+        <w:t>18. PvP Injury Reduce Table (Complete)</w:t>
+      </w:r>
+    </w:p>
+    <w:p>
+      <w:r>
+        <w:t>The complete PvP damage reduction factor for all 220 levels, extracted from Level.json. The raw value is divided by 10,000 to get the actual factor. Damage is divided by this factor, so a factor of 25x means you deal 1/25th of your PvE damage in PvP:</w:t>
+      </w:r>
+    </w:p>
+    <w:tbl>
+      <w:tblPr>
+        <w:tblStyle w:val="LightGrid-Accent1"/>
+        <w:tblW w:type="auto" w:w="0"/>
+        <w:tblLook w:firstColumn="1" w:firstRow="1" w:lastColumn="0" w:lastRow="0" w:noHBand="0" w:noVBand="1" w:val="04A0"/>
+      </w:tblPr>
+      <w:tblGrid>
+        <w:gridCol w:w="2160"/>
+        <w:gridCol w:w="2160"/>
+        <w:gridCol w:w="2160"/>
+        <w:gridCol w:w="2160"/>
+      </w:tblGrid>
+      <w:tr>
+        <w:tc>
+          <w:tcPr>
+            <w:tcW w:type="dxa" w:w="2160"/>
+          </w:tcPr>
+          <w:p>
+            <w:r>
+              <w:rPr>
+                <w:b/>
+              </w:rPr>
+              <w:t>Avg Level</w:t>
+            </w:r>
+          </w:p>
+        </w:tc>
+        <w:tc>
+          <w:tcPr>
+            <w:tcW w:type="dxa" w:w="2160"/>
+          </w:tcPr>
+          <w:p>
+            <w:r>
+              <w:rPr>
+                <w:b/>
+              </w:rPr>
+              <w:t>Raw Value</w:t>
+            </w:r>
+          </w:p>
+        </w:tc>
+        <w:tc>
+          <w:tcPr>
+            <w:tcW w:type="dxa" w:w="2160"/>
+          </w:tcPr>
+          <w:p>
+            <w:r>
+              <w:rPr>
+                <w:b/>
+              </w:rPr>
+              <w:t>Factor</w:t>
+            </w:r>
+          </w:p>
+        </w:tc>
+        <w:tc>
+          <w:tcPr>
+            <w:tcW w:type="dxa" w:w="2160"/>
+          </w:tcPr>
+          <w:p>
+            <w:r>
+              <w:rPr>
+                <w:b/>
+              </w:rPr>
+              <w:t>PvP Damage</w:t>
+            </w:r>
+          </w:p>
+        </w:tc>
+      </w:tr>
+      <w:tr>
+        <w:tc>
+          <w:tcPr>
+            <w:tcW w:type="dxa" w:w="2160"/>
+          </w:tcPr>
+          <w:p>
+            <w:r>
+              <w:t>1</w:t>
+            </w:r>
+          </w:p>
+        </w:tc>
+        <w:tc>
+          <w:tcPr>
+            <w:tcW w:type="dxa" w:w="2160"/>
+          </w:tcPr>
+          <w:p>
+            <w:r>
+              <w:t>10,000</w:t>
+            </w:r>
+          </w:p>
+        </w:tc>
+        <w:tc>
+          <w:tcPr>
+            <w:tcW w:type="dxa" w:w="2160"/>
+          </w:tcPr>
+          <w:p>
+            <w:r>
+              <w:t>1.0x</w:t>
+            </w:r>
+          </w:p>
+        </w:tc>
+        <w:tc>
+          <w:tcPr>
+            <w:tcW w:type="dxa" w:w="2160"/>
+          </w:tcPr>
+          <w:p>
+            <w:r>
+              <w:t>100% of PvE</w:t>
+            </w:r>
+          </w:p>
+        </w:tc>
+      </w:tr>
+      <w:tr>
+        <w:tc>
+          <w:tcPr>
+            <w:tcW w:type="dxa" w:w="2160"/>
+          </w:tcPr>
+          <w:p>
+            <w:r>
+              <w:t>10</w:t>
+            </w:r>
+          </w:p>
+        </w:tc>
+        <w:tc>
+          <w:tcPr>
+            <w:tcW w:type="dxa" w:w="2160"/>
+          </w:tcPr>
+          <w:p>
+            <w:r>
+              <w:t>14,000</w:t>
+            </w:r>
+          </w:p>
+        </w:tc>
+        <w:tc>
+          <w:tcPr>
+            <w:tcW w:type="dxa" w:w="2160"/>
+          </w:tcPr>
+          <w:p>
+            <w:r>
+              <w:t>1.4x</w:t>
+            </w:r>
+          </w:p>
+        </w:tc>
+        <w:tc>
+          <w:tcPr>
+            <w:tcW w:type="dxa" w:w="2160"/>
+          </w:tcPr>
+          <w:p>
+            <w:r>
+              <w:t>~71%</w:t>
+            </w:r>
+          </w:p>
+        </w:tc>
+      </w:tr>
+      <w:tr>
+        <w:tc>
+          <w:tcPr>
+            <w:tcW w:type="dxa" w:w="2160"/>
+          </w:tcPr>
+          <w:p>
+            <w:r>
+              <w:t>20</w:t>
+            </w:r>
+          </w:p>
+        </w:tc>
+        <w:tc>
+          <w:tcPr>
+            <w:tcW w:type="dxa" w:w="2160"/>
+          </w:tcPr>
+          <w:p>
+            <w:r>
+              <w:t>34,500</w:t>
+            </w:r>
+          </w:p>
+        </w:tc>
+        <w:tc>
+          <w:tcPr>
+            <w:tcW w:type="dxa" w:w="2160"/>
+          </w:tcPr>
+          <w:p>
+            <w:r>
+              <w:t>3.5x</w:t>
+            </w:r>
+          </w:p>
+        </w:tc>
+        <w:tc>
+          <w:tcPr>
+            <w:tcW w:type="dxa" w:w="2160"/>
+          </w:tcPr>
+          <w:p>
+            <w:r>
+              <w:t>~29%</w:t>
+            </w:r>
+          </w:p>
+        </w:tc>
+      </w:tr>
+      <w:tr>
+        <w:tc>
+          <w:tcPr>
+            <w:tcW w:type="dxa" w:w="2160"/>
+          </w:tcPr>
+          <w:p>
+            <w:r>
+              <w:t>30</w:t>
+            </w:r>
+          </w:p>
+        </w:tc>
+        <w:tc>
+          <w:tcPr>
+            <w:tcW w:type="dxa" w:w="2160"/>
+          </w:tcPr>
+          <w:p>
+            <w:r>
+              <w:t>58,000</w:t>
+            </w:r>
+          </w:p>
+        </w:tc>
+        <w:tc>
+          <w:tcPr>
+            <w:tcW w:type="dxa" w:w="2160"/>
+          </w:tcPr>
+          <w:p>
+            <w:r>
+              <w:t>5.8x</w:t>
+            </w:r>
+          </w:p>
+        </w:tc>
+        <w:tc>
+          <w:tcPr>
+            <w:tcW w:type="dxa" w:w="2160"/>
+          </w:tcPr>
+          <w:p>
+            <w:r>
+              <w:t>~17%</w:t>
+            </w:r>
+          </w:p>
+        </w:tc>
+      </w:tr>
+      <w:tr>
+        <w:tc>
+          <w:tcPr>
+            <w:tcW w:type="dxa" w:w="2160"/>
+          </w:tcPr>
+          <w:p>
+            <w:r>
+              <w:t>40</w:t>
+            </w:r>
+          </w:p>
+        </w:tc>
+        <w:tc>
+          <w:tcPr>
+            <w:tcW w:type="dxa" w:w="2160"/>
+          </w:tcPr>
+          <w:p>
+            <w:r>
+              <w:t>85,000</w:t>
+            </w:r>
+          </w:p>
+        </w:tc>
+        <w:tc>
+          <w:tcPr>
+            <w:tcW w:type="dxa" w:w="2160"/>
+          </w:tcPr>
+          <w:p>
+            <w:r>
+              <w:t>8.5x</w:t>
+            </w:r>
+          </w:p>
+        </w:tc>
+        <w:tc>
+          <w:tcPr>
+            <w:tcW w:type="dxa" w:w="2160"/>
+          </w:tcPr>
+          <w:p>
+            <w:r>
+              <w:t>~12%</w:t>
+            </w:r>
+          </w:p>
+        </w:tc>
+      </w:tr>
+      <w:tr>
+        <w:tc>
+          <w:tcPr>
+            <w:tcW w:type="dxa" w:w="2160"/>
+          </w:tcPr>
+          <w:p>
+            <w:r>
+              <w:t>50</w:t>
+            </w:r>
+          </w:p>
+        </w:tc>
+        <w:tc>
+          <w:tcPr>
+            <w:tcW w:type="dxa" w:w="2160"/>
+          </w:tcPr>
+          <w:p>
+            <w:r>
+              <w:t>110,000</w:t>
+            </w:r>
+          </w:p>
+        </w:tc>
+        <w:tc>
+          <w:tcPr>
+            <w:tcW w:type="dxa" w:w="2160"/>
+          </w:tcPr>
+          <w:p>
+            <w:r>
+              <w:t>11.0x</w:t>
+            </w:r>
+          </w:p>
+        </w:tc>
+        <w:tc>
+          <w:tcPr>
+            <w:tcW w:type="dxa" w:w="2160"/>
+          </w:tcPr>
+          <w:p>
+            <w:r>
+              <w:t>~9%</w:t>
+            </w:r>
+          </w:p>
+        </w:tc>
+      </w:tr>
+      <w:tr>
+        <w:tc>
+          <w:tcPr>
+            <w:tcW w:type="dxa" w:w="2160"/>
+          </w:tcPr>
+          <w:p>
+            <w:r>
+              <w:t>60</w:t>
+            </w:r>
+          </w:p>
+        </w:tc>
+        <w:tc>
+          <w:tcPr>
+            <w:tcW w:type="dxa" w:w="2160"/>
+          </w:tcPr>
+          <w:p>
+            <w:r>
+              <w:t>137,500</w:t>
+            </w:r>
+          </w:p>
+        </w:tc>
+        <w:tc>
+          <w:tcPr>
+            <w:tcW w:type="dxa" w:w="2160"/>
+          </w:tcPr>
+          <w:p>
+            <w:r>
+              <w:t>13.8x</w:t>
+            </w:r>
+          </w:p>
+        </w:tc>
+        <w:tc>
+          <w:tcPr>
+            <w:tcW w:type="dxa" w:w="2160"/>
+          </w:tcPr>
+          <w:p>
+            <w:r>
+              <w:t>~7%</w:t>
+            </w:r>
+          </w:p>
+        </w:tc>
+      </w:tr>
+      <w:tr>
+        <w:tc>
+          <w:tcPr>
+            <w:tcW w:type="dxa" w:w="2160"/>
+          </w:tcPr>
+          <w:p>
+            <w:r>
+              <w:t>70</w:t>
+            </w:r>
+          </w:p>
+        </w:tc>
+        <w:tc>
+          <w:tcPr>
+            <w:tcW w:type="dxa" w:w="2160"/>
+          </w:tcPr>
+          <w:p>
+            <w:r>
+              <w:t>192,000</w:t>
+            </w:r>
+          </w:p>
+        </w:tc>
+        <w:tc>
+          <w:tcPr>
+            <w:tcW w:type="dxa" w:w="2160"/>
+          </w:tcPr>
+          <w:p>
+            <w:r>
+              <w:t>19.2x</w:t>
+            </w:r>
+          </w:p>
+        </w:tc>
+        <w:tc>
+          <w:tcPr>
+            <w:tcW w:type="dxa" w:w="2160"/>
+          </w:tcPr>
+          <w:p>
+            <w:r>
+              <w:t>~5%</w:t>
+            </w:r>
+          </w:p>
+        </w:tc>
+      </w:tr>
+      <w:tr>
+        <w:tc>
+          <w:tcPr>
+            <w:tcW w:type="dxa" w:w="2160"/>
+          </w:tcPr>
+          <w:p>
+            <w:r>
+              <w:t>80</w:t>
+            </w:r>
+          </w:p>
+        </w:tc>
+        <w:tc>
+          <w:tcPr>
+            <w:tcW w:type="dxa" w:w="2160"/>
+          </w:tcPr>
+          <w:p>
+            <w:r>
+              <w:t>276,000</w:t>
+            </w:r>
+          </w:p>
+        </w:tc>
+        <w:tc>
+          <w:tcPr>
+            <w:tcW w:type="dxa" w:w="2160"/>
+          </w:tcPr>
+          <w:p>
+            <w:r>
+              <w:t>27.6x</w:t>
+            </w:r>
+          </w:p>
+        </w:tc>
+        <w:tc>
+          <w:tcPr>
+            <w:tcW w:type="dxa" w:w="2160"/>
+          </w:tcPr>
+          <w:p>
+            <w:r>
+              <w:t>~4%</w:t>
+            </w:r>
+          </w:p>
+        </w:tc>
+      </w:tr>
+      <w:tr>
+        <w:tc>
+          <w:tcPr>
+            <w:tcW w:type="dxa" w:w="2160"/>
+          </w:tcPr>
+          <w:p>
+            <w:r>
+              <w:t>90</w:t>
+            </w:r>
+          </w:p>
+        </w:tc>
+        <w:tc>
+          <w:tcPr>
+            <w:tcW w:type="dxa" w:w="2160"/>
+          </w:tcPr>
+          <w:p>
+            <w:r>
+              <w:t>396,000</w:t>
+            </w:r>
+          </w:p>
+        </w:tc>
+        <w:tc>
+          <w:tcPr>
+            <w:tcW w:type="dxa" w:w="2160"/>
+          </w:tcPr>
+          <w:p>
+            <w:r>
+              <w:t>39.6x</w:t>
+            </w:r>
+          </w:p>
+        </w:tc>
+        <w:tc>
+          <w:tcPr>
+            <w:tcW w:type="dxa" w:w="2160"/>
+          </w:tcPr>
+          <w:p>
+            <w:r>
+              <w:t>~3%</w:t>
+            </w:r>
+          </w:p>
+        </w:tc>
+      </w:tr>
+      <w:tr>
+        <w:tc>
+          <w:tcPr>
+            <w:tcW w:type="dxa" w:w="2160"/>
+          </w:tcPr>
+          <w:p>
+            <w:r>
+              <w:t>100</w:t>
+            </w:r>
+          </w:p>
+        </w:tc>
+        <w:tc>
+          <w:tcPr>
+            <w:tcW w:type="dxa" w:w="2160"/>
+          </w:tcPr>
+          <w:p>
+            <w:r>
+              <w:t>569,000</w:t>
+            </w:r>
+          </w:p>
+        </w:tc>
+        <w:tc>
+          <w:tcPr>
+            <w:tcW w:type="dxa" w:w="2160"/>
+          </w:tcPr>
+          <w:p>
+            <w:r>
+              <w:t>56.9x</w:t>
+            </w:r>
+          </w:p>
+        </w:tc>
+        <w:tc>
+          <w:tcPr>
+            <w:tcW w:type="dxa" w:w="2160"/>
+          </w:tcPr>
+          <w:p>
+            <w:r>
+              <w:t>~2%</w:t>
+            </w:r>
+          </w:p>
+        </w:tc>
+      </w:tr>
+      <w:tr>
+        <w:tc>
+          <w:tcPr>
+            <w:tcW w:type="dxa" w:w="2160"/>
+          </w:tcPr>
+          <w:p>
+            <w:r>
+              <w:t>120</w:t>
+            </w:r>
+          </w:p>
+        </w:tc>
+        <w:tc>
+          <w:tcPr>
+            <w:tcW w:type="dxa" w:w="2160"/>
+          </w:tcPr>
+          <w:p>
+            <w:r>
+              <w:t>1,173,000</w:t>
+            </w:r>
+          </w:p>
+        </w:tc>
+        <w:tc>
+          <w:tcPr>
+            <w:tcW w:type="dxa" w:w="2160"/>
+          </w:tcPr>
+          <w:p>
+            <w:r>
+              <w:t>117.3x</w:t>
+            </w:r>
+          </w:p>
+        </w:tc>
+        <w:tc>
+          <w:tcPr>
+            <w:tcW w:type="dxa" w:w="2160"/>
+          </w:tcPr>
+          <w:p>
+            <w:r>
+              <w:t>~0.9%</w:t>
+            </w:r>
+          </w:p>
+        </w:tc>
+      </w:tr>
+      <w:tr>
+        <w:tc>
+          <w:tcPr>
+            <w:tcW w:type="dxa" w:w="2160"/>
+          </w:tcPr>
+          <w:p>
+            <w:r>
+              <w:t>140</w:t>
+            </w:r>
+          </w:p>
+        </w:tc>
+        <w:tc>
+          <w:tcPr>
+            <w:tcW w:type="dxa" w:w="2160"/>
+          </w:tcPr>
+          <w:p>
+            <w:r>
+              <w:t>2,216,000</w:t>
+            </w:r>
+          </w:p>
+        </w:tc>
+        <w:tc>
+          <w:tcPr>
+            <w:tcW w:type="dxa" w:w="2160"/>
+          </w:tcPr>
+          <w:p>
+            <w:r>
+              <w:t>221.6x</w:t>
+            </w:r>
+          </w:p>
+        </w:tc>
+        <w:tc>
+          <w:tcPr>
+            <w:tcW w:type="dxa" w:w="2160"/>
+          </w:tcPr>
+          <w:p>
+            <w:r>
+              <w:t>~0.5%</w:t>
+            </w:r>
+          </w:p>
+        </w:tc>
+      </w:tr>
+      <w:tr>
+        <w:tc>
+          <w:tcPr>
+            <w:tcW w:type="dxa" w:w="2160"/>
+          </w:tcPr>
+          <w:p>
+            <w:r>
+              <w:t>160</w:t>
+            </w:r>
+          </w:p>
+        </w:tc>
+        <w:tc>
+          <w:tcPr>
+            <w:tcW w:type="dxa" w:w="2160"/>
+          </w:tcPr>
+          <w:p>
+            <w:r>
+              <w:t>3,423,000</w:t>
+            </w:r>
+          </w:p>
+        </w:tc>
+        <w:tc>
+          <w:tcPr>
+            <w:tcW w:type="dxa" w:w="2160"/>
+          </w:tcPr>
+          <w:p>
+            <w:r>
+              <w:t>342.3x</w:t>
+            </w:r>
+          </w:p>
+        </w:tc>
+        <w:tc>
+          <w:tcPr>
+            <w:tcW w:type="dxa" w:w="2160"/>
+          </w:tcPr>
+          <w:p>
+            <w:r>
+              <w:t>~0.3%</w:t>
+            </w:r>
+          </w:p>
+        </w:tc>
+      </w:tr>
+      <w:tr>
+        <w:tc>
+          <w:tcPr>
+            <w:tcW w:type="dxa" w:w="2160"/>
+          </w:tcPr>
+          <w:p>
+            <w:r>
+              <w:t>180</w:t>
+            </w:r>
+          </w:p>
+        </w:tc>
+        <w:tc>
+          <w:tcPr>
+            <w:tcW w:type="dxa" w:w="2160"/>
+          </w:tcPr>
+          <w:p>
+            <w:r>
+              <w:t>4,717,000</w:t>
+            </w:r>
+          </w:p>
+        </w:tc>
+        <w:tc>
+          <w:tcPr>
+            <w:tcW w:type="dxa" w:w="2160"/>
+          </w:tcPr>
+          <w:p>
+            <w:r>
+              <w:t>471.7x</w:t>
+            </w:r>
+          </w:p>
+        </w:tc>
+        <w:tc>
+          <w:tcPr>
+            <w:tcW w:type="dxa" w:w="2160"/>
+          </w:tcPr>
+          <w:p>
+            <w:r>
+              <w:t>~0.2%</w:t>
+            </w:r>
+          </w:p>
+        </w:tc>
+      </w:tr>
+      <w:tr>
+        <w:tc>
+          <w:tcPr>
+            <w:tcW w:type="dxa" w:w="2160"/>
+          </w:tcPr>
+          <w:p>
+            <w:r>
+              <w:t>200</w:t>
+            </w:r>
+          </w:p>
+        </w:tc>
+        <w:tc>
+          <w:tcPr>
+            <w:tcW w:type="dxa" w:w="2160"/>
+          </w:tcPr>
+          <w:p>
+            <w:r>
+              <w:t>6,090,000</w:t>
+            </w:r>
+          </w:p>
+        </w:tc>
+        <w:tc>
+          <w:tcPr>
+            <w:tcW w:type="dxa" w:w="2160"/>
+          </w:tcPr>
+          <w:p>
+            <w:r>
+              <w:t>609.0x</w:t>
+            </w:r>
+          </w:p>
+        </w:tc>
+        <w:tc>
+          <w:tcPr>
+            <w:tcW w:type="dxa" w:w="2160"/>
+          </w:tcPr>
+          <w:p>
+            <w:r>
+              <w:t>~0.16%</w:t>
+            </w:r>
+          </w:p>
+        </w:tc>
+      </w:tr>
+      <w:tr>
+        <w:tc>
+          <w:tcPr>
+            <w:tcW w:type="dxa" w:w="2160"/>
+          </w:tcPr>
+          <w:p>
+            <w:r>
+              <w:t>220</w:t>
+            </w:r>
+          </w:p>
+        </w:tc>
+        <w:tc>
+          <w:tcPr>
+            <w:tcW w:type="dxa" w:w="2160"/>
+          </w:tcPr>
+          <w:p>
+            <w:r>
+              <w:t>7,540,000</w:t>
+            </w:r>
+          </w:p>
+        </w:tc>
+        <w:tc>
+          <w:tcPr>
+            <w:tcW w:type="dxa" w:w="2160"/>
+          </w:tcPr>
+          <w:p>
+            <w:r>
+              <w:t>754.0x</w:t>
+            </w:r>
+          </w:p>
+        </w:tc>
+        <w:tc>
+          <w:tcPr>
+            <w:tcW w:type="dxa" w:w="2160"/>
+          </w:tcPr>
+          <w:p>
+            <w:r>
+              <w:t>~0.13%</w:t>
+            </w:r>
+          </w:p>
+        </w:tc>
+      </w:tr>
+    </w:tbl>
+    <w:p/>
+    <w:p>
+      <w:r>
+        <w:t>The factor grows roughly exponentially through level 130, then transitions to roughly linear growth (~67-73 per level). At high levels, PvP damage is reduced to a tiny fraction of PvE damage — a level 200 fight deals about 0.16% of PvE damage.</w:t>
+      </w:r>
+    </w:p>
+    <w:p>
+      <w:r>
+        <w:br w:type="page"/>
+      </w:r>
+    </w:p>
+    <w:p>
+      <w:pPr>
+        <w:pStyle w:val="Heading1"/>
+      </w:pPr>
+      <w:r>
+        <w:t>19. Attribute Caps</w:t>
+      </w:r>
+    </w:p>
+    <w:p>
+      <w:r>
+        <w:t>The following attributes have hard upper limits enforced by the game (from the up_limit field in Attribute.json). When a stat reaches its cap, further bonuses are ignored:</w:t>
+      </w:r>
+    </w:p>
+    <w:tbl>
+      <w:tblPr>
+        <w:tblStyle w:val="LightGrid-Accent1"/>
+        <w:tblW w:type="auto" w:w="0"/>
+        <w:tblLook w:firstColumn="1" w:firstRow="1" w:lastColumn="0" w:lastRow="0" w:noHBand="0" w:noVBand="1" w:val="04A0"/>
+      </w:tblPr>
+      <w:tblGrid>
+        <w:gridCol w:w="2160"/>
+        <w:gridCol w:w="2160"/>
+        <w:gridCol w:w="2160"/>
+        <w:gridCol w:w="2160"/>
+      </w:tblGrid>
+      <w:tr>
+        <w:tc>
+          <w:tcPr>
+            <w:tcW w:type="dxa" w:w="2160"/>
+          </w:tcPr>
+          <w:p>
+            <w:r>
+              <w:rPr>
+                <w:b/>
+              </w:rPr>
+              <w:t>Attribute</w:t>
+            </w:r>
+          </w:p>
+        </w:tc>
+        <w:tc>
+          <w:tcPr>
+            <w:tcW w:type="dxa" w:w="2160"/>
+          </w:tcPr>
+          <w:p>
+            <w:r>
+              <w:rPr>
+                <w:b/>
+              </w:rPr>
+              <w:t>ID</w:t>
+            </w:r>
+          </w:p>
+        </w:tc>
+        <w:tc>
+          <w:tcPr>
+            <w:tcW w:type="dxa" w:w="2160"/>
+          </w:tcPr>
+          <w:p>
+            <w:r>
+              <w:rPr>
+                <w:b/>
+              </w:rPr>
+              <w:t>Cap</w:t>
+            </w:r>
+          </w:p>
+        </w:tc>
+        <w:tc>
+          <w:tcPr>
+            <w:tcW w:type="dxa" w:w="2160"/>
+          </w:tcPr>
+          <w:p>
+            <w:r>
+              <w:rPr>
+                <w:b/>
+              </w:rPr>
+              <w:t>Meaning</w:t>
+            </w:r>
+          </w:p>
+        </w:tc>
+      </w:tr>
+      <w:tr>
+        <w:tc>
+          <w:tcPr>
+            <w:tcW w:type="dxa" w:w="2160"/>
+          </w:tcPr>
+          <w:p>
+            <w:r>
+              <w:t>att_hpsteal</w:t>
+            </w:r>
+          </w:p>
+        </w:tc>
+        <w:tc>
+          <w:tcPr>
+            <w:tcW w:type="dxa" w:w="2160"/>
+          </w:tcPr>
+          <w:p>
+            <w:r>
+              <w:t>1014</w:t>
+            </w:r>
+          </w:p>
+        </w:tc>
+        <w:tc>
+          <w:tcPr>
+            <w:tcW w:type="dxa" w:w="2160"/>
+          </w:tcPr>
+          <w:p>
+            <w:r>
+              <w:t>100%</w:t>
+            </w:r>
+          </w:p>
+        </w:tc>
+        <w:tc>
+          <w:tcPr>
+            <w:tcW w:type="dxa" w:w="2160"/>
+          </w:tcPr>
+          <w:p>
+            <w:r>
+              <w:t>ATK HP Steal</w:t>
+            </w:r>
+          </w:p>
+        </w:tc>
+      </w:tr>
+      <w:tr>
+        <w:tc>
+          <w:tcPr>
+            <w:tcW w:type="dxa" w:w="2160"/>
+          </w:tcPr>
+          <w:p>
+            <w:r>
+              <w:t>skill_hpsteal</w:t>
+            </w:r>
+          </w:p>
+        </w:tc>
+        <w:tc>
+          <w:tcPr>
+            <w:tcW w:type="dxa" w:w="2160"/>
+          </w:tcPr>
+          <w:p>
+            <w:r>
+              <w:t>1015</w:t>
+            </w:r>
+          </w:p>
+        </w:tc>
+        <w:tc>
+          <w:tcPr>
+            <w:tcW w:type="dxa" w:w="2160"/>
+          </w:tcPr>
+          <w:p>
+            <w:r>
+              <w:t>100%</w:t>
+            </w:r>
+          </w:p>
+        </w:tc>
+        <w:tc>
+          <w:tcPr>
+            <w:tcW w:type="dxa" w:w="2160"/>
+          </w:tcPr>
+          <w:p>
+            <w:r>
+              <w:t>Skill HP Steal</w:t>
+            </w:r>
+          </w:p>
+        </w:tc>
+      </w:tr>
+      <w:tr>
+        <w:tc>
+          <w:tcPr>
+            <w:tcW w:type="dxa" w:w="2160"/>
+          </w:tcPr>
+          <w:p>
+            <w:r>
+              <w:t>att_resist</w:t>
+            </w:r>
+          </w:p>
+        </w:tc>
+        <w:tc>
+          <w:tcPr>
+            <w:tcW w:type="dxa" w:w="2160"/>
+          </w:tcPr>
+          <w:p>
+            <w:r>
+              <w:t>1018</w:t>
+            </w:r>
+          </w:p>
+        </w:tc>
+        <w:tc>
+          <w:tcPr>
+            <w:tcW w:type="dxa" w:w="2160"/>
+          </w:tcPr>
+          <w:p>
+            <w:r>
+              <w:t>80%</w:t>
+            </w:r>
+          </w:p>
+        </w:tc>
+        <w:tc>
+          <w:tcPr>
+            <w:tcW w:type="dxa" w:w="2160"/>
+          </w:tcPr>
+          <w:p>
+            <w:r>
+              <w:t>Basic ATK Resistance</w:t>
+            </w:r>
+          </w:p>
+        </w:tc>
+      </w:tr>
+      <w:tr>
+        <w:tc>
+          <w:tcPr>
+            <w:tcW w:type="dxa" w:w="2160"/>
+          </w:tcPr>
+          <w:p>
+            <w:r>
+              <w:t>skill_resist</w:t>
+            </w:r>
+          </w:p>
+        </w:tc>
+        <w:tc>
+          <w:tcPr>
+            <w:tcW w:type="dxa" w:w="2160"/>
+          </w:tcPr>
+          <w:p>
+            <w:r>
+              <w:t>1019</w:t>
+            </w:r>
+          </w:p>
+        </w:tc>
+        <w:tc>
+          <w:tcPr>
+            <w:tcW w:type="dxa" w:w="2160"/>
+          </w:tcPr>
+          <w:p>
+            <w:r>
+              <w:t>80%</w:t>
+            </w:r>
+          </w:p>
+        </w:tc>
+        <w:tc>
+          <w:tcPr>
+            <w:tcW w:type="dxa" w:w="2160"/>
+          </w:tcPr>
+          <w:p>
+            <w:r>
+              <w:t>Skill Resistance</w:t>
+            </w:r>
+          </w:p>
+        </w:tc>
+      </w:tr>
+      <w:tr>
+        <w:tc>
+          <w:tcPr>
+            <w:tcW w:type="dxa" w:w="2160"/>
+          </w:tcPr>
+          <w:p>
+            <w:r>
+              <w:t>partner_resist</w:t>
+            </w:r>
+          </w:p>
+        </w:tc>
+        <w:tc>
+          <w:tcPr>
+            <w:tcW w:type="dxa" w:w="2160"/>
+          </w:tcPr>
+          <w:p>
+            <w:r>
+              <w:t>1020</w:t>
+            </w:r>
+          </w:p>
+        </w:tc>
+        <w:tc>
+          <w:tcPr>
+            <w:tcW w:type="dxa" w:w="2160"/>
+          </w:tcPr>
+          <w:p>
+            <w:r>
+              <w:t>80%</w:t>
+            </w:r>
+          </w:p>
+        </w:tc>
+        <w:tc>
+          <w:tcPr>
+            <w:tcW w:type="dxa" w:w="2160"/>
+          </w:tcPr>
+          <w:p>
+            <w:r>
+              <w:t>Pal Resistance</w:t>
+            </w:r>
+          </w:p>
+        </w:tc>
+      </w:tr>
+      <w:tr>
+        <w:tc>
+          <w:tcPr>
+            <w:tcW w:type="dxa" w:w="2160"/>
+          </w:tcPr>
+          <w:p>
+            <w:r>
+              <w:t>resist</w:t>
+            </w:r>
+          </w:p>
+        </w:tc>
+        <w:tc>
+          <w:tcPr>
+            <w:tcW w:type="dxa" w:w="2160"/>
+          </w:tcPr>
+          <w:p>
+            <w:r>
+              <w:t>1021</w:t>
+            </w:r>
+          </w:p>
+        </w:tc>
+        <w:tc>
+          <w:tcPr>
+            <w:tcW w:type="dxa" w:w="2160"/>
+          </w:tcPr>
+          <w:p>
+            <w:r>
+              <w:t>80%</w:t>
+            </w:r>
+          </w:p>
+        </w:tc>
+        <w:tc>
+          <w:tcPr>
+            <w:tcW w:type="dxa" w:w="2160"/>
+          </w:tcPr>
+          <w:p>
+            <w:r>
+              <w:t>DMG Resistance</w:t>
+            </w:r>
+          </w:p>
+        </w:tc>
+      </w:tr>
+      <w:tr>
+        <w:tc>
+          <w:tcPr>
+            <w:tcW w:type="dxa" w:w="2160"/>
+          </w:tcPr>
+          <w:p>
+            <w:r>
+              <w:t>double_hit_def</w:t>
+            </w:r>
+          </w:p>
+        </w:tc>
+        <w:tc>
+          <w:tcPr>
+            <w:tcW w:type="dxa" w:w="2160"/>
+          </w:tcPr>
+          <w:p>
+            <w:r>
+              <w:t>1034</w:t>
+            </w:r>
+          </w:p>
+        </w:tc>
+        <w:tc>
+          <w:tcPr>
+            <w:tcW w:type="dxa" w:w="2160"/>
+          </w:tcPr>
+          <w:p>
+            <w:r>
+              <w:t>80%</w:t>
+            </w:r>
+          </w:p>
+        </w:tc>
+        <w:tc>
+          <w:tcPr>
+            <w:tcW w:type="dxa" w:w="2160"/>
+          </w:tcPr>
+          <w:p>
+            <w:r>
+              <w:t>Combo Resistance</w:t>
+            </w:r>
+          </w:p>
+        </w:tc>
+      </w:tr>
+      <w:tr>
+        <w:tc>
+          <w:tcPr>
+            <w:tcW w:type="dxa" w:w="2160"/>
+          </w:tcPr>
+          <w:p>
+            <w:r>
+              <w:t>counter_def</w:t>
+            </w:r>
+          </w:p>
+        </w:tc>
+        <w:tc>
+          <w:tcPr>
+            <w:tcW w:type="dxa" w:w="2160"/>
+          </w:tcPr>
+          <w:p>
+            <w:r>
+              <w:t>1035</w:t>
+            </w:r>
+          </w:p>
+        </w:tc>
+        <w:tc>
+          <w:tcPr>
+            <w:tcW w:type="dxa" w:w="2160"/>
+          </w:tcPr>
+          <w:p>
+            <w:r>
+              <w:t>80%</w:t>
+            </w:r>
+          </w:p>
+        </w:tc>
+        <w:tc>
+          <w:tcPr>
+            <w:tcW w:type="dxa" w:w="2160"/>
+          </w:tcPr>
+          <w:p>
+            <w:r>
+              <w:t>Counter Resistance</w:t>
+            </w:r>
+          </w:p>
+        </w:tc>
+      </w:tr>
+      <w:tr>
+        <w:tc>
+          <w:tcPr>
+            <w:tcW w:type="dxa" w:w="2160"/>
+          </w:tcPr>
+          <w:p>
+            <w:r>
+              <w:t>control_res</w:t>
+            </w:r>
+          </w:p>
+        </w:tc>
+        <w:tc>
+          <w:tcPr>
+            <w:tcW w:type="dxa" w:w="2160"/>
+          </w:tcPr>
+          <w:p>
+            <w:r>
+              <w:t>1042</w:t>
+            </w:r>
+          </w:p>
+        </w:tc>
+        <w:tc>
+          <w:tcPr>
+            <w:tcW w:type="dxa" w:w="2160"/>
+          </w:tcPr>
+          <w:p>
+            <w:r>
+              <w:t>100%</w:t>
+            </w:r>
+          </w:p>
+        </w:tc>
+        <w:tc>
+          <w:tcPr>
+            <w:tcW w:type="dxa" w:w="2160"/>
+          </w:tcPr>
+          <w:p>
+            <w:r>
+              <w:t>Control Resistance</w:t>
+            </w:r>
+          </w:p>
+        </w:tc>
+      </w:tr>
+      <w:tr>
+        <w:tc>
+          <w:tcPr>
+            <w:tcW w:type="dxa" w:w="2160"/>
+          </w:tcPr>
+          <w:p>
+            <w:r>
+              <w:t>boss_def</w:t>
+            </w:r>
+          </w:p>
+        </w:tc>
+        <w:tc>
+          <w:tcPr>
+            <w:tcW w:type="dxa" w:w="2160"/>
+          </w:tcPr>
+          <w:p>
+            <w:r>
+              <w:t>1052</w:t>
+            </w:r>
+          </w:p>
+        </w:tc>
+        <w:tc>
+          <w:tcPr>
+            <w:tcW w:type="dxa" w:w="2160"/>
+          </w:tcPr>
+          <w:p>
+            <w:r>
+              <w:t>80%</w:t>
+            </w:r>
+          </w:p>
+        </w:tc>
+        <w:tc>
+          <w:tcPr>
+            <w:tcW w:type="dxa" w:w="2160"/>
+          </w:tcPr>
+          <w:p>
+            <w:r>
+              <w:t>Boss Defense</w:t>
+            </w:r>
+          </w:p>
+        </w:tc>
+      </w:tr>
+      <w:tr>
+        <w:tc>
+          <w:tcPr>
+            <w:tcW w:type="dxa" w:w="2160"/>
+          </w:tcPr>
+          <w:p>
+            <w:r>
+              <w:t>season_cannon_att_def</w:t>
+            </w:r>
+          </w:p>
+        </w:tc>
+        <w:tc>
+          <w:tcPr>
+            <w:tcW w:type="dxa" w:w="2160"/>
+          </w:tcPr>
+          <w:p>
+            <w:r>
+              <w:t>1059</w:t>
+            </w:r>
+          </w:p>
+        </w:tc>
+        <w:tc>
+          <w:tcPr>
+            <w:tcW w:type="dxa" w:w="2160"/>
+          </w:tcPr>
+          <w:p>
+            <w:r>
+              <w:t>60%</w:t>
+            </w:r>
+          </w:p>
+        </w:tc>
+        <w:tc>
+          <w:tcPr>
+            <w:tcW w:type="dxa" w:w="2160"/>
+          </w:tcPr>
+          <w:p>
+            <w:r>
+              <w:t>Cannon ATK Defense</w:t>
+            </w:r>
+          </w:p>
+        </w:tc>
+      </w:tr>
+    </w:tbl>
+    <w:p/>
+    <w:p>
+      <w:r>
+        <w:t>All other combat attributes — including ATK, HP, DEF, all damage multipliers, crit rate, crit damage, and Total DMG Bonus/RES — have NO cap. They can be stacked indefinitely.</w:t>
+      </w:r>
+    </w:p>
+    <w:p>
+      <w:r>
+        <w:br w:type="page"/>
+      </w:r>
+    </w:p>
+    <w:p>
+      <w:pPr>
+        <w:pStyle w:val="Heading1"/>
+      </w:pPr>
+      <w:r>
+        <w:t>20. Extended Attribute System (192 Total Attributes)</w:t>
+      </w:r>
+    </w:p>
+    <w:p>
+      <w:r>
+        <w:t>The game has 192 attributes organized across 7 ID ranges. The 82 core battle attributes (IDs 1001-1082) are documented in Section 2. Here are the additional ranges used by the stat assembly pipeline:</w:t>
+      </w:r>
+    </w:p>
+    <w:tbl>
+      <w:tblPr>
+        <w:tblStyle w:val="LightGrid-Accent1"/>
+        <w:tblW w:type="auto" w:w="0"/>
+        <w:tblLook w:firstColumn="1" w:firstRow="1" w:lastColumn="0" w:lastRow="0" w:noHBand="0" w:noVBand="1" w:val="04A0"/>
+      </w:tblPr>
+      <w:tblGrid>
+        <w:gridCol w:w="2160"/>
+        <w:gridCol w:w="2160"/>
+        <w:gridCol w:w="2160"/>
+        <w:gridCol w:w="2160"/>
+      </w:tblGrid>
+      <w:tr>
+        <w:tc>
+          <w:tcPr>
+            <w:tcW w:type="dxa" w:w="2160"/>
+          </w:tcPr>
+          <w:p>
+            <w:r>
+              <w:rPr>
+                <w:b/>
+              </w:rPr>
+              <w:t>ID Range</w:t>
+            </w:r>
+          </w:p>
+        </w:tc>
+        <w:tc>
+          <w:tcPr>
+            <w:tcW w:type="dxa" w:w="2160"/>
+          </w:tcPr>
+          <w:p>
+            <w:r>
+              <w:rPr>
+                <w:b/>
+              </w:rPr>
+              <w:t>Count</w:t>
+            </w:r>
+          </w:p>
+        </w:tc>
+        <w:tc>
+          <w:tcPr>
+            <w:tcW w:type="dxa" w:w="2160"/>
+          </w:tcPr>
+          <w:p>
+            <w:r>
+              <w:rPr>
+                <w:b/>
+              </w:rPr>
+              <w:t>Category</w:t>
+            </w:r>
+          </w:p>
+        </w:tc>
+        <w:tc>
+          <w:tcPr>
+            <w:tcW w:type="dxa" w:w="2160"/>
+          </w:tcPr>
+          <w:p>
+            <w:r>
+              <w:rPr>
+                <w:b/>
+              </w:rPr>
+              <w:t>Examples</w:t>
+            </w:r>
+          </w:p>
+        </w:tc>
+      </w:tr>
+      <w:tr>
+        <w:tc>
+          <w:tcPr>
+            <w:tcW w:type="dxa" w:w="2160"/>
+          </w:tcPr>
+          <w:p>
+            <w:r>
+              <w:t>1-24</w:t>
+            </w:r>
+          </w:p>
+        </w:tc>
+        <w:tc>
+          <w:tcPr>
+            <w:tcW w:type="dxa" w:w="2160"/>
+          </w:tcPr>
+          <w:p>
+            <w:r>
+              <w:t>4</w:t>
+            </w:r>
+          </w:p>
+        </w:tc>
+        <w:tc>
+          <w:tcPr>
+            <w:tcW w:type="dxa" w:w="2160"/>
+          </w:tcPr>
+          <w:p>
+            <w:r>
+              <w:t>Base Totals</w:t>
+            </w:r>
+          </w:p>
+        </w:tc>
+        <w:tc>
+          <w:tcPr>
+            <w:tcW w:type="dxa" w:w="2160"/>
+          </w:tcPr>
+          <w:p>
+            <w:r>
+              <w:t>total_att, total_hp, total_att_speed, total_def</w:t>
+            </w:r>
+          </w:p>
+        </w:tc>
+      </w:tr>
+      <w:tr>
+        <w:tc>
+          <w:tcPr>
+            <w:tcW w:type="dxa" w:w="2160"/>
+          </w:tcPr>
+          <w:p>
+            <w:r>
+              <w:t>1001-1082</w:t>
+            </w:r>
+          </w:p>
+        </w:tc>
+        <w:tc>
+          <w:tcPr>
+            <w:tcW w:type="dxa" w:w="2160"/>
+          </w:tcPr>
+          <w:p>
+            <w:r>
+              <w:t>82</w:t>
+            </w:r>
+          </w:p>
+        </w:tc>
+        <w:tc>
+          <w:tcPr>
+            <w:tcW w:type="dxa" w:w="2160"/>
+          </w:tcPr>
+          <w:p>
+            <w:r>
+              <w:t>Core Battle</w:t>
+            </w:r>
+          </w:p>
+        </w:tc>
+        <w:tc>
+          <w:tcPr>
+            <w:tcW w:type="dxa" w:w="2160"/>
+          </w:tcPr>
+          <w:p>
+            <w:r>
+              <w:t>att, hp, def, crit_rate, etc. (Section 2)</w:t>
+            </w:r>
+          </w:p>
+        </w:tc>
+      </w:tr>
+      <w:tr>
+        <w:tc>
+          <w:tcPr>
+            <w:tcW w:type="dxa" w:w="2160"/>
+          </w:tcPr>
+          <w:p>
+            <w:r>
+              <w:t>2001-2036</w:t>
+            </w:r>
+          </w:p>
+        </w:tc>
+        <w:tc>
+          <w:tcPr>
+            <w:tcW w:type="dxa" w:w="2160"/>
+          </w:tcPr>
+          <w:p>
+            <w:r>
+              <w:t>36</w:t>
+            </w:r>
+          </w:p>
+        </w:tc>
+        <w:tc>
+          <w:tcPr>
+            <w:tcW w:type="dxa" w:w="2160"/>
+          </w:tcPr>
+          <w:p>
+            <w:r>
+              <w:t>Bonus/Add</w:t>
+            </w:r>
+          </w:p>
+        </w:tc>
+        <w:tc>
+          <w:tcPr>
+            <w:tcW w:type="dxa" w:w="2160"/>
+          </w:tcPr>
+          <w:p>
+            <w:r>
+              <w:t>att_base_add, hp_add, def_base_add, crit_dam_add</w:t>
+            </w:r>
+          </w:p>
+        </w:tc>
+      </w:tr>
+      <w:tr>
+        <w:tc>
+          <w:tcPr>
+            <w:tcW w:type="dxa" w:w="2160"/>
+          </w:tcPr>
+          <w:p>
+            <w:r>
+              <w:t>3001-3024</w:t>
+            </w:r>
+          </w:p>
+        </w:tc>
+        <w:tc>
+          <w:tcPr>
+            <w:tcW w:type="dxa" w:w="2160"/>
+          </w:tcPr>
+          <w:p>
+            <w:r>
+              <w:t>4</w:t>
+            </w:r>
+          </w:p>
+        </w:tc>
+        <w:tc>
+          <w:tcPr>
+            <w:tcW w:type="dxa" w:w="2160"/>
+          </w:tcPr>
+          <w:p>
+            <w:r>
+              <w:t>Cumulative Totals</w:t>
+            </w:r>
+          </w:p>
+        </w:tc>
+        <w:tc>
+          <w:tcPr>
+            <w:tcW w:type="dxa" w:w="2160"/>
+          </w:tcPr>
+          <w:p>
+            <w:r>
+              <w:t>att_total_add, hp_total_add, def_total_add</w:t>
+            </w:r>
+          </w:p>
+        </w:tc>
+      </w:tr>
+      <w:tr>
+        <w:tc>
+          <w:tcPr>
+            <w:tcW w:type="dxa" w:w="2160"/>
+          </w:tcPr>
+          <w:p>
+            <w:r>
+              <w:t>4001-4006</w:t>
+            </w:r>
+          </w:p>
+        </w:tc>
+        <w:tc>
+          <w:tcPr>
+            <w:tcW w:type="dxa" w:w="2160"/>
+          </w:tcPr>
+          <w:p>
+            <w:r>
+              <w:t>6</w:t>
+            </w:r>
+          </w:p>
+        </w:tc>
+        <w:tc>
+          <w:tcPr>
+            <w:tcW w:type="dxa" w:w="2160"/>
+          </w:tcPr>
+          <w:p>
+            <w:r>
+              <w:t>Partner Effects</w:t>
+            </w:r>
+          </w:p>
+        </w:tc>
+        <w:tc>
+          <w:tcPr>
+            <w:tcW w:type="dxa" w:w="2160"/>
+          </w:tcPr>
+          <w:p>
+            <w:r>
+              <w:t>partner_crit_rate, partner_partner_dam, partner_att_speed</w:t>
+            </w:r>
+          </w:p>
+        </w:tc>
+      </w:tr>
+      <w:tr>
+        <w:tc>
+          <w:tcPr>
+            <w:tcW w:type="dxa" w:w="2160"/>
+          </w:tcPr>
+          <w:p>
+            <w:r>
+              <w:t>5001-5012</w:t>
+            </w:r>
+          </w:p>
+        </w:tc>
+        <w:tc>
+          <w:tcPr>
+            <w:tcW w:type="dxa" w:w="2160"/>
+          </w:tcPr>
+          <w:p>
+            <w:r>
+              <w:t>12</w:t>
+            </w:r>
+          </w:p>
+        </w:tc>
+        <w:tc>
+          <w:tcPr>
+            <w:tcW w:type="dxa" w:w="2160"/>
+          </w:tcPr>
+          <w:p>
+            <w:r>
+              <w:t>Rogue Mode</w:t>
+            </w:r>
+          </w:p>
+        </w:tc>
+        <w:tc>
+          <w:tcPr>
+            <w:tcW w:type="dxa" w:w="2160"/>
+          </w:tcPr>
+          <w:p>
+            <w:r>
+              <w:t>rogue_att, rogue_def, rogue_hp, rogue_crit_dam</w:t>
+            </w:r>
+          </w:p>
+        </w:tc>
+      </w:tr>
+      <w:tr>
+        <w:tc>
+          <w:tcPr>
+            <w:tcW w:type="dxa" w:w="2160"/>
+          </w:tcPr>
+          <w:p>
+            <w:r>
+              <w:t>6001-6007</w:t>
+            </w:r>
+          </w:p>
+        </w:tc>
+        <w:tc>
+          <w:tcPr>
+            <w:tcW w:type="dxa" w:w="2160"/>
+          </w:tcPr>
+          <w:p>
+            <w:r>
+              <w:t>7</w:t>
+            </w:r>
+          </w:p>
+        </w:tc>
+        <w:tc>
+          <w:tcPr>
+            <w:tcW w:type="dxa" w:w="2160"/>
+          </w:tcPr>
+          <w:p>
+            <w:r>
+              <w:t>Spirit System</w:t>
+            </w:r>
+          </w:p>
+        </w:tc>
+        <w:tc>
+          <w:tcPr>
+            <w:tcW w:type="dxa" w:w="2160"/>
+          </w:tcPr>
+          <w:p>
+            <w:r>
+              <w:t>spirit_dam_add, spirit_att, spirit_hp (Section 2)</w:t>
+            </w:r>
+          </w:p>
+        </w:tc>
+      </w:tr>
+      <w:tr>
+        <w:tc>
+          <w:tcPr>
+            <w:tcW w:type="dxa" w:w="2160"/>
+          </w:tcPr>
+          <w:p>
+            <w:r>
+              <w:t>10001-10030</w:t>
+            </w:r>
+          </w:p>
+        </w:tc>
+        <w:tc>
+          <w:tcPr>
+            <w:tcW w:type="dxa" w:w="2160"/>
+          </w:tcPr>
+          <w:p>
+            <w:r>
+              <w:t>30</w:t>
+            </w:r>
+          </w:p>
+        </w:tc>
+        <w:tc>
+          <w:tcPr>
+            <w:tcW w:type="dxa" w:w="2160"/>
+          </w:tcPr>
+          <w:p>
+            <w:r>
+              <w:t>Season</w:t>
+            </w:r>
+          </w:p>
+        </w:tc>
+        <w:tc>
+          <w:tcPr>
+            <w:tcW w:type="dxa" w:w="2160"/>
+          </w:tcPr>
+          <w:p>
+            <w:r>
+              <w:t>season_att, season_hp, season_pve_dam_add</w:t>
+            </w:r>
+          </w:p>
+        </w:tc>
+      </w:tr>
+    </w:tbl>
+    <w:p/>
+    <w:p>
+      <w:r>
+        <w:t>The 2000-range attributes are percentage-based group bonuses that feed into the MetaAttrib calculation for their parent core attribute. For example, att_base_add (2001) and att_add (2002) both contribute to att (1001) through the group bonus system documented in Section 2's MetaAttrib formula.</w:t>
+      </w:r>
+    </w:p>
+    <w:p>
+      <w:r>
+        <w:t>The 4000-range partner attributes are dedicated modifiers for pal/pet units, while the 5000-range rogue attributes are bonuses specific to the rogue game mode. The 10000-range season attributes are used during seasonal content events (sailing, ships, etc.).</w:t>
       </w:r>
     </w:p>
     <w:sectPr>

</xml_diff>

<commit_message>
Resolve unknowns #17 and #18: buff mutex types and server validation
- Fully document 5 buff mutex/stacking types (replace, unique, stack
  w/ max, unique per caster, refresh per caster) with pre-mutex checks
  (control immunity, IGNORE_BUFFIDS, CONTROL_RES reduction)
- Upgrade server-side validation to partially resolved: deterministic
  FixMath, operator replay protocol, anti-tamper checkValue, mode-
  dependent reporting detail
- Add DOCX sections 21 (Buff Stacking Rules) and 22 (Server Validation)
- Regenerate DOCX
</commit_message>
<xml_diff>
--- a/reverse-engineered/LOM_Combat_Reference_Plain_English.docx
+++ b/reverse-engineered/LOM_Combat_Reference_Plain_English.docx
@@ -6070,6 +6070,373 @@
     <w:p>
       <w:r>
         <w:t>The 4000-range partner attributes are dedicated modifiers for pal/pet units, while the 5000-range rogue attributes are bonuses specific to the rogue game mode. The 10000-range season attributes are used during seasonal content events (sailing, ships, etc.).</w:t>
+      </w:r>
+    </w:p>
+    <w:p>
+      <w:r>
+        <w:br w:type="page"/>
+      </w:r>
+    </w:p>
+    <w:p>
+      <w:pPr>
+        <w:pStyle w:val="Heading1"/>
+      </w:pPr>
+      <w:r>
+        <w:t>21. Buff Stacking Rules (Mutex Types)</w:t>
+      </w:r>
+    </w:p>
+    <w:p>
+      <w:r>
+        <w:t>When a buff is applied and the same buff ID already exists on the target, the "mutex" field in buff config determines what happens. There are 5 mutex types:</w:t>
+      </w:r>
+    </w:p>
+    <w:tbl>
+      <w:tblPr>
+        <w:tblStyle w:val="LightGrid-Accent1"/>
+        <w:tblW w:type="auto" w:w="0"/>
+        <w:tblLook w:firstColumn="1" w:firstRow="1" w:lastColumn="0" w:lastRow="0" w:noHBand="0" w:noVBand="1" w:val="04A0"/>
+      </w:tblPr>
+      <w:tblGrid>
+        <w:gridCol w:w="2880"/>
+        <w:gridCol w:w="2880"/>
+        <w:gridCol w:w="2880"/>
+      </w:tblGrid>
+      <w:tr>
+        <w:tc>
+          <w:tcPr>
+            <w:tcW w:type="dxa" w:w="2880"/>
+          </w:tcPr>
+          <w:p>
+            <w:r>
+              <w:rPr>
+                <w:b/>
+              </w:rPr>
+              <w:t>Mutex</w:t>
+            </w:r>
+          </w:p>
+        </w:tc>
+        <w:tc>
+          <w:tcPr>
+            <w:tcW w:type="dxa" w:w="2880"/>
+          </w:tcPr>
+          <w:p>
+            <w:r>
+              <w:rPr>
+                <w:b/>
+              </w:rPr>
+              <w:t>Name</w:t>
+            </w:r>
+          </w:p>
+        </w:tc>
+        <w:tc>
+          <w:tcPr>
+            <w:tcW w:type="dxa" w:w="2880"/>
+          </w:tcPr>
+          <w:p>
+            <w:r>
+              <w:rPr>
+                <w:b/>
+              </w:rPr>
+              <w:t>Behavior</w:t>
+            </w:r>
+          </w:p>
+        </w:tc>
+      </w:tr>
+      <w:tr>
+        <w:tc>
+          <w:tcPr>
+            <w:tcW w:type="dxa" w:w="2880"/>
+          </w:tcPr>
+          <w:p>
+            <w:r>
+              <w:t>1</w:t>
+            </w:r>
+          </w:p>
+        </w:tc>
+        <w:tc>
+          <w:tcPr>
+            <w:tcW w:type="dxa" w:w="2880"/>
+          </w:tcPr>
+          <w:p>
+            <w:r>
+              <w:t>Replace</w:t>
+            </w:r>
+          </w:p>
+        </w:tc>
+        <w:tc>
+          <w:tcPr>
+            <w:tcW w:type="dxa" w:w="2880"/>
+          </w:tcPr>
+          <w:p>
+            <w:r>
+              <w:t>Stop ALL existing instances of this buff ID, then add the new buff</w:t>
+            </w:r>
+          </w:p>
+        </w:tc>
+      </w:tr>
+      <w:tr>
+        <w:tc>
+          <w:tcPr>
+            <w:tcW w:type="dxa" w:w="2880"/>
+          </w:tcPr>
+          <w:p>
+            <w:r>
+              <w:t>2</w:t>
+            </w:r>
+          </w:p>
+        </w:tc>
+        <w:tc>
+          <w:tcPr>
+            <w:tcW w:type="dxa" w:w="2880"/>
+          </w:tcPr>
+          <w:p>
+            <w:r>
+              <w:t>Unique</w:t>
+            </w:r>
+          </w:p>
+        </w:tc>
+        <w:tc>
+          <w:tcPr>
+            <w:tcW w:type="dxa" w:w="2880"/>
+          </w:tcPr>
+          <w:p>
+            <w:r>
+              <w:t>If any instance with this ID exists on target, reject the new buff entirely</w:t>
+            </w:r>
+          </w:p>
+        </w:tc>
+      </w:tr>
+      <w:tr>
+        <w:tc>
+          <w:tcPr>
+            <w:tcW w:type="dxa" w:w="2880"/>
+          </w:tcPr>
+          <w:p>
+            <w:r>
+              <w:t>3</w:t>
+            </w:r>
+          </w:p>
+        </w:tc>
+        <w:tc>
+          <w:tcPr>
+            <w:tcW w:type="dxa" w:w="2880"/>
+          </w:tcPr>
+          <w:p>
+            <w:r>
+              <w:t>Stack w/ Max</w:t>
+            </w:r>
+          </w:p>
+        </w:tc>
+        <w:tc>
+          <w:tcPr>
+            <w:tcW w:type="dxa" w:w="2880"/>
+          </w:tcPr>
+          <w:p>
+            <w:r>
+              <w:t>Multiple instances coexist up to add_max limit. Refreshes all existing durations. Removes oldest active buff when limit is exceeded</w:t>
+            </w:r>
+          </w:p>
+        </w:tc>
+      </w:tr>
+      <w:tr>
+        <w:tc>
+          <w:tcPr>
+            <w:tcW w:type="dxa" w:w="2880"/>
+          </w:tcPr>
+          <w:p>
+            <w:r>
+              <w:t>4</w:t>
+            </w:r>
+          </w:p>
+        </w:tc>
+        <w:tc>
+          <w:tcPr>
+            <w:tcW w:type="dxa" w:w="2880"/>
+          </w:tcPr>
+          <w:p>
+            <w:r>
+              <w:t>Unique per Caster</w:t>
+            </w:r>
+          </w:p>
+        </w:tc>
+        <w:tc>
+          <w:tcPr>
+            <w:tcW w:type="dxa" w:w="2880"/>
+          </w:tcPr>
+          <w:p>
+            <w:r>
+              <w:t>One instance per caster. If same caster re-applies, new buff is rejected</w:t>
+            </w:r>
+          </w:p>
+        </w:tc>
+      </w:tr>
+      <w:tr>
+        <w:tc>
+          <w:tcPr>
+            <w:tcW w:type="dxa" w:w="2880"/>
+          </w:tcPr>
+          <w:p>
+            <w:r>
+              <w:t>5</w:t>
+            </w:r>
+          </w:p>
+        </w:tc>
+        <w:tc>
+          <w:tcPr>
+            <w:tcW w:type="dxa" w:w="2880"/>
+          </w:tcPr>
+          <w:p>
+            <w:r>
+              <w:t>Refresh per Caster</w:t>
+            </w:r>
+          </w:p>
+        </w:tc>
+        <w:tc>
+          <w:tcPr>
+            <w:tcW w:type="dxa" w:w="2880"/>
+          </w:tcPr>
+          <w:p>
+            <w:r>
+              <w:t>Like type 4, but resets the existing buff's duration instead of rejecting</w:t>
+            </w:r>
+          </w:p>
+        </w:tc>
+      </w:tr>
+    </w:tbl>
+    <w:p/>
+    <w:p>
+      <w:r>
+        <w:t>Before mutex logic runs, several pre-checks occur:</w:t>
+      </w:r>
+    </w:p>
+    <w:p>
+      <w:r>
+        <w:t>1. Control immunity: if target has notControlled or invincible buff, control-type buffs (stun, ban_skill, throw, bound, ban_act) are skipped</w:t>
+      </w:r>
+    </w:p>
+    <w:p>
+      <w:r>
+        <w:t>2. IGNORE_BUFFIDS: if target has this buff group and its param5 array contains the incoming buff ID, the buff is blocked</w:t>
+      </w:r>
+    </w:p>
+    <w:p>
+      <w:r>
+        <w:t>3. CONTROL_RES duration reduction: for stun and ban_act buffs, duration is reduced by the target's Control Resistance:</w:t>
+      </w:r>
+    </w:p>
+    <w:p>
+      <w:pPr>
+        <w:spacing w:before="80" w:after="80"/>
+        <w:ind w:left="432"/>
+      </w:pPr>
+      <w:r>
+        <w:rPr>
+          <w:rFonts w:ascii="Consolas" w:hAnsi="Consolas"/>
+          <w:color w:val="333333"/>
+          <w:sz w:val="18"/>
+        </w:rPr>
+        <w:t>duration = round(duration - round(duration * CONTROL_RES))</w:t>
+      </w:r>
+    </w:p>
+    <w:p>
+      <w:r>
+        <w:t>4. Shield time extension: for shield buffs, duration is increased by the shield_time_extra attribute</w:t>
+      </w:r>
+    </w:p>
+    <w:p>
+      <w:r>
+        <w:rPr>
+          <w:b/>
+          <w:color w:val="CC4400"/>
+        </w:rPr>
+        <w:t>Buffs with config.type == 0 (Instant) bypass the mutex system entirely. They execute start() + destroy() immediately and are never tracked in the buff controller.</w:t>
+      </w:r>
+    </w:p>
+    <w:p>
+      <w:r>
+        <w:br w:type="page"/>
+      </w:r>
+    </w:p>
+    <w:p>
+      <w:pPr>
+        <w:pStyle w:val="Heading1"/>
+      </w:pPr>
+      <w:r>
+        <w:t>22. Server-Side Battle Validation</w:t>
+      </w:r>
+    </w:p>
+    <w:p>
+      <w:r>
+        <w:t>The client runs all battle calculations deterministically using FixMath (fixed-point math with 4-decimal precision). No random number generator or seed is used — identical inputs always produce identical outputs. This enables server-side re-simulation.</w:t>
+      </w:r>
+    </w:p>
+    <w:p>
+      <w:pPr>
+        <w:pStyle w:val="Heading2"/>
+      </w:pPr>
+      <w:r>
+        <w:t>Client-Server Protocol</w:t>
+      </w:r>
+    </w:p>
+    <w:p>
+      <w:r>
+        <w:t>Different battle modes send different levels of detail to the server:</w:t>
+      </w:r>
+    </w:p>
+    <w:p>
+      <w:r>
+        <w:t>Complex battles (dungeon, GvG, escort_boss): Client sends an "operators" array recording every action — unit ID, frame number, and skill ID. The server can replay the entire battle from this sequence.</w:t>
+      </w:r>
+    </w:p>
+    <w:p>
+      <w:r>
+        <w:t>Simple battles (farm, auto-escort): Client sends only the win_role_id (winner's ID) — minimal validation.</w:t>
+      </w:r>
+    </w:p>
+    <w:p>
+      <w:r>
+        <w:t>Every server response (_s2c message) includes a "code" field (int32). A value of 0 means success; non-zero means the server rejected the result.</w:t>
+      </w:r>
+    </w:p>
+    <w:p>
+      <w:pPr>
+        <w:pStyle w:val="Heading2"/>
+      </w:pPr>
+      <w:r>
+        <w:t>Anti-Tamper</w:t>
+      </w:r>
+    </w:p>
+    <w:p>
+      <w:r>
+        <w:t>MetaAttrib (the attribute storage class) uses a check value to detect memory manipulation:</w:t>
+      </w:r>
+    </w:p>
+    <w:p>
+      <w:pPr>
+        <w:spacing w:before="80" w:after="80"/>
+        <w:ind w:left="432"/>
+      </w:pPr>
+      <w:r>
+        <w:rPr>
+          <w:rFonts w:ascii="Consolas" w:hAnsi="Consolas"/>
+          <w:color w:val="333333"/>
+          <w:sz w:val="18"/>
+        </w:rPr>
+        <w:t>_checkValue = 32 XOR baseValue</w:t>
+      </w:r>
+    </w:p>
+    <w:p>
+      <w:r>
+        <w:t>When an attribute is read, the stored value is verified against this check. This prevents client-side memory editors from modifying stats without detection.</w:t>
+      </w:r>
+    </w:p>
+    <w:p>
+      <w:r>
+        <w:rPr>
+          <w:b/>
+          <w:color w:val="CC4400"/>
+        </w:rPr>
+        <w:t>What remains unknown: exact server validation tolerances, error code meanings, whether the server always re-simulates or spot-checks, and how proc rates (crit/combo/counter triggers) are synchronized between client and server.</w:t>
       </w:r>
     </w:p>
     <w:sectPr>

</xml_diff>